<commit_message>
Update documentation file structure
</commit_message>
<xml_diff>
--- a/docs/User Guide Heatoptimisation.docx
+++ b/docs/User Guide Heatoptimisation.docx
@@ -244,6 +244,86 @@
           <w:lang w:val="en-US"/>
         </w:rPr>
         <w:t>Initial Setup</w:t>
+      </w:r>
+    </w:p>
+    <w:p>
+      <w:r>
+        <w:t xml:space="preserve">Repository File Structure</w:t>
+      </w:r>
+    </w:p>
+    <w:p>
+      <w:r>
+        <w:t xml:space="preserve">The repository contains the following active folders and files:</w:t>
+      </w:r>
+    </w:p>
+    <w:p>
+      <w:r>
+        <w:t xml:space="preserve">docs/</w:t>
+      </w:r>
+    </w:p>
+    <w:p>
+      <w:r>
+        <w:t xml:space="preserve">- User Guide Heatoptimisation.docx: this user guide.</w:t>
+      </w:r>
+    </w:p>
+    <w:p>
+      <w:r>
+        <w:t xml:space="preserve">home-assistant/</w:t>
+      </w:r>
+    </w:p>
+    <w:p>
+      <w:r>
+        <w:t xml:space="preserve">- AM2305_temp_hum.js: Shelly script for AM2305 temperature/humidity sensor.</w:t>
+      </w:r>
+    </w:p>
+    <w:p>
+      <w:r>
+        <w:t xml:space="preserve">- configuration.yaml: reference configuration for Lovelace dashboard, packages, and GatewayAPI SMS rest_command.</w:t>
+      </w:r>
+    </w:p>
+    <w:p>
+      <w:r>
+        <w:t xml:space="preserve">- varmeoptimering_dashboard.yaml: main Lovelace dashboard. It includes the economy view.</w:t>
+      </w:r>
+    </w:p>
+    <w:p>
+      <w:r>
+        <w:t xml:space="preserve">- varmeoptimering_economy_view.yaml: Lovelace economy view for price, consumption, fuel, storage, and SCOP.</w:t>
+      </w:r>
+    </w:p>
+    <w:p>
+      <w:r>
+        <w:t xml:space="preserve">- varmeoptimering_package.yaml: Home Assistant package with helpers, template sensors, alarms, scripts, and automations.</w:t>
+      </w:r>
+    </w:p>
+    <w:p>
+      <w:r>
+        <w:t xml:space="preserve">- varmeoptimering_economy_package.yaml: Home Assistant package with economy, energy, runtime, and utility meter sensors.</w:t>
+      </w:r>
+    </w:p>
+    <w:p>
+      <w:r>
+        <w:t xml:space="preserve">- varmeoptimering_notifikationer.yaml: automations for notifications and alarm handling.</w:t>
+      </w:r>
+    </w:p>
+    <w:p>
+      <w:r>
+        <w:t xml:space="preserve">images/</w:t>
+      </w:r>
+    </w:p>
+    <w:p>
+      <w:r>
+        <w:t xml:space="preserve">- Screenshots used by the README and documentation.</w:t>
+      </w:r>
+    </w:p>
+    <w:p>
+      <w:r>
+        <w:t xml:space="preserve">Installation note:</w:t>
+      </w:r>
+    </w:p>
+    <w:p>
+      <w:r>
+        <w:t xml:space="preserve">Copy the dashboard files to the Lovelace dashboard folder, copy both package files to the Home Assistant packages folder, and use configuration.yaml as a reference for enabling packages, dashboard YAML mode, and SMS services.</w:t>
       </w:r>
     </w:p>
     <w:p>

</xml_diff>